<commit_message>
fix: reorder review mode buttons and update UI labels
- Move "全部执行" to first position as default
- Change default review mode from compare to both
- Update violation label texts

Co-Authored-By: Claude Opus 4.7 <noreply@anthropic.com>
</commit_message>
<xml_diff>
--- a/docs/外包服务标准合同-测试1.docx
+++ b/docs/外包服务标准合同-测试1.docx
@@ -596,7 +596,7 @@
           <w:rFonts w:hint="eastAsia"/>
           <w:lang w:eastAsia="zh-CN"/>
         </w:rPr>
-        <w:t>保费收入依据《中华人民共和国民法典》《中华人民共和国劳动合同法》《中华人民共和国个人信息保护法》等相关法律法规的规定，甲乙双方本着平等自愿、协商一致、诚实信用、合作共赢的原则，就甲方将相关业务外包给乙方提供专业服务事宜，经友好协商，达成如下协议，以资双方共同遵守执行。</w:t>
+        <w:t>依据《中华人民共和国民法典》《中华人民共和国劳动合同法》《中华人民共和国个人信息保护法》等相关法律法规的规定，甲乙双方本着平等自愿、协商一致、诚实信用、合作共赢的原则，就甲方将相关业务外包给乙方提供专业服务事宜，经友好协商，达成如下协议，以资双方共同遵守执行。</w:t>
       </w:r>
     </w:p>
     <w:p>
@@ -640,16 +640,7 @@
           <w:rFonts w:hint="eastAsia"/>
           <w:lang w:eastAsia="zh-CN"/>
         </w:rPr>
-        <w:t>乙方凭借自身的专业能力和管理优势，按照甲方的业务要求和服务标准，提供符合岗位任职条件的服务人员、管理团队及相关运营支持，承接甲方__保费收入___人力_外包__业务的外包服</w:t>
-      </w:r>
-      <w:bookmarkStart w:id="2" w:name="_GoBack"/>
-      <w:bookmarkEnd w:id="2"/>
-      <w:r>
-        <w:rPr>
-          <w:rFonts w:hint="eastAsia"/>
-          <w:lang w:eastAsia="zh-CN"/>
-        </w:rPr>
-        <w:t>务工作，</w:t>
+        <w:t>乙方凭借自身的专业能力和管理优势，按照甲方的业务要求和服务标准，提供符合岗位任职条件的服务人员、管理团队及相关运营支持，承接甲方__保费收入___人力_外包__业务的外包服务工作，</w:t>
       </w:r>
       <w:r>
         <w:rPr>
@@ -951,21 +942,8 @@
           <w:lang w:eastAsia="zh-CN"/>
         </w:rPr>
       </w:pPr>
-      <w:r>
-        <w:rPr>
-          <w:rFonts w:hint="eastAsia"/>
-          <w:lang w:eastAsia="zh-CN"/>
-        </w:rPr>
-        <w:t>（2）业务调整权：有权根据自身业务发展需要，合理调整外包业务的规模、范围和服务要求，提前书面通知乙方并协商处理相关事宜；</w:t>
-      </w:r>
-    </w:p>
-    <w:p>
-      <w:pPr>
-        <w:pStyle w:val="13"/>
-        <w:rPr>
-          <w:lang w:eastAsia="zh-CN"/>
-        </w:rPr>
-      </w:pPr>
+      <w:bookmarkStart w:id="2" w:name="_GoBack"/>
+      <w:bookmarkEnd w:id="2"/>
       <w:r>
         <w:rPr>
           <w:rFonts w:hint="eastAsia"/>
@@ -4658,6 +4636,12 @@
             <w:insideH w:val="none" w:color="auto" w:sz="0" w:space="0"/>
             <w:insideV w:val="none" w:color="auto" w:sz="0" w:space="0"/>
           </w:tblBorders>
+          <w:tblCellMar>
+            <w:top w:w="0" w:type="dxa"/>
+            <w:left w:w="108" w:type="dxa"/>
+            <w:bottom w:w="0" w:type="dxa"/>
+            <w:right w:w="108" w:type="dxa"/>
+          </w:tblCellMar>
         </w:tblPrEx>
         <w:tc>
           <w:tcPr>
@@ -5019,7 +5003,7 @@
     <w:lsdException w:uiPriority="99" w:name="Normal Indent"/>
     <w:lsdException w:uiPriority="99" w:name="footnote text"/>
     <w:lsdException w:uiPriority="99" w:name="annotation text"/>
-    <w:lsdException w:uiPriority="99" w:semiHidden="0" w:name="header"/>
+    <w:lsdException w:qFormat="1" w:uiPriority="99" w:semiHidden="0" w:name="header"/>
     <w:lsdException w:qFormat="1" w:uiPriority="99" w:semiHidden="0" w:name="footer"/>
     <w:lsdException w:uiPriority="99" w:name="index heading"/>
     <w:lsdException w:qFormat="1" w:uiPriority="35" w:name="caption"/>
@@ -5312,6 +5296,7 @@
     <w:basedOn w:val="1"/>
     <w:link w:val="19"/>
     <w:unhideWhenUsed/>
+    <w:qFormat/>
     <w:uiPriority w:val="99"/>
     <w:pPr>
       <w:pBdr>
@@ -5395,6 +5380,7 @@
   </w:style>
   <w:style w:type="paragraph" w:customStyle="1" w:styleId="11">
     <w:name w:val="H2Style"/>
+    <w:qFormat/>
     <w:uiPriority w:val="0"/>
     <w:pPr>
       <w:spacing w:before="240" w:after="120" w:line="276" w:lineRule="auto"/>
@@ -5466,6 +5452,7 @@
   </w:style>
   <w:style w:type="paragraph" w:customStyle="1" w:styleId="16">
     <w:name w:val="Heading 1 Style"/>
+    <w:qFormat/>
     <w:uiPriority w:val="0"/>
     <w:pPr>
       <w:spacing w:before="360" w:after="240" w:line="276" w:lineRule="auto"/>

</xml_diff>